<commit_message>
Bake TOC/list page numbers into the build; refresh build outputs
- scripts/fill_lists.py renders via LibreOffice and repeats until page
  numbers settle, so the TOC and the two lists display without a Word field
  refresh; wired into build.sh after add_page_numbers.py.
- Rebuilt Documentation.docx and standee.pdf.
- Track the raw UET logo under diagrams/.
</commit_message>
<xml_diff>
--- a/build/Documentation.docx
+++ b/build/Documentation.docx
@@ -1342,10 +1342,842 @@
           </w:r>
         </w:p>
         <w:p>
+          <w:pPr>
+            <w:pStyle w:val="toc 1"/>
+            <w:ind w:left="0"/>
+            <w:tabs>
+              <w:tab w:val="right" w:leader="dot" w:pos="8640"/>
+            </w:tabs>
+          </w:pPr>
           <w:r>
-            <w:fldChar w:fldCharType="begin" w:dirty="true"/>
-            <w:instrText xml:space="preserve">TOC \o "1-3" \h \z \u</w:instrText>
+            <w:fldChar w:fldCharType="begin"/>
+            <w:instrText xml:space="preserve"> TOC \o "1-3" \h \z \u </w:instrText>
             <w:fldChar w:fldCharType="separate"/>
+          </w:r>
+          <w:r>
+            <w:t xml:space="preserve">I. Industrial Supervisor Approval Certificate</w:t>
+          </w:r>
+          <w:r>
+            <w:tab/>
+            <w:t>2</w:t>
+          </w:r>
+        </w:p>
+        <w:p>
+          <w:pPr>
+            <w:pStyle w:val="toc 1"/>
+            <w:ind w:left="0"/>
+            <w:tabs>
+              <w:tab w:val="right" w:leader="dot" w:pos="8640"/>
+            </w:tabs>
+          </w:pPr>
+          <w:r>
+            <w:t xml:space="preserve">II. Declaration</w:t>
+          </w:r>
+          <w:r>
+            <w:tab/>
+            <w:t>3</w:t>
+          </w:r>
+        </w:p>
+        <w:p>
+          <w:pPr>
+            <w:pStyle w:val="toc 1"/>
+            <w:ind w:left="0"/>
+            <w:tabs>
+              <w:tab w:val="right" w:leader="dot" w:pos="8640"/>
+            </w:tabs>
+          </w:pPr>
+          <w:r>
+            <w:t xml:space="preserve">III. Plagiarism Declaration/ Plagiarism Report</w:t>
+          </w:r>
+          <w:r>
+            <w:tab/>
+            <w:t>4</w:t>
+          </w:r>
+        </w:p>
+        <w:p>
+          <w:pPr>
+            <w:pStyle w:val="toc 1"/>
+            <w:ind w:left="0"/>
+            <w:tabs>
+              <w:tab w:val="right" w:leader="dot" w:pos="8640"/>
+            </w:tabs>
+          </w:pPr>
+          <w:r>
+            <w:t xml:space="preserve">IV. Dedication</w:t>
+          </w:r>
+          <w:r>
+            <w:tab/>
+            <w:t>5</w:t>
+          </w:r>
+        </w:p>
+        <w:p>
+          <w:pPr>
+            <w:pStyle w:val="toc 1"/>
+            <w:ind w:left="0"/>
+            <w:tabs>
+              <w:tab w:val="right" w:leader="dot" w:pos="8640"/>
+            </w:tabs>
+          </w:pPr>
+          <w:r>
+            <w:t xml:space="preserve">V. Acknowledgements</w:t>
+          </w:r>
+          <w:r>
+            <w:tab/>
+            <w:t>6</w:t>
+          </w:r>
+        </w:p>
+        <w:p>
+          <w:pPr>
+            <w:pStyle w:val="toc 1"/>
+            <w:ind w:left="0"/>
+            <w:tabs>
+              <w:tab w:val="right" w:leader="dot" w:pos="8640"/>
+            </w:tabs>
+          </w:pPr>
+          <w:r>
+            <w:t xml:space="preserve">Abstract</w:t>
+          </w:r>
+          <w:r>
+            <w:tab/>
+            <w:t>7</w:t>
+          </w:r>
+        </w:p>
+        <w:p>
+          <w:pPr>
+            <w:pStyle w:val="toc 1"/>
+            <w:ind w:left="0"/>
+            <w:tabs>
+              <w:tab w:val="right" w:leader="dot" w:pos="8640"/>
+            </w:tabs>
+          </w:pPr>
+          <w:r>
+            <w:t xml:space="preserve">List of Abbreviations</w:t>
+          </w:r>
+          <w:r>
+            <w:tab/>
+            <w:t>12</w:t>
+          </w:r>
+        </w:p>
+        <w:p>
+          <w:pPr>
+            <w:pStyle w:val="toc 1"/>
+            <w:ind w:left="0"/>
+            <w:tabs>
+              <w:tab w:val="right" w:leader="dot" w:pos="8640"/>
+            </w:tabs>
+          </w:pPr>
+          <w:r>
+            <w:t xml:space="preserve">CHAPTER 1: INTRODUCTION</w:t>
+          </w:r>
+          <w:r>
+            <w:tab/>
+            <w:t>13</w:t>
+          </w:r>
+        </w:p>
+        <w:p>
+          <w:pPr>
+            <w:pStyle w:val="toc 1"/>
+            <w:ind w:left="220"/>
+            <w:tabs>
+              <w:tab w:val="right" w:leader="dot" w:pos="8640"/>
+            </w:tabs>
+          </w:pPr>
+          <w:r>
+            <w:t xml:space="preserve">1.1 Background</w:t>
+          </w:r>
+          <w:r>
+            <w:tab/>
+            <w:t>13</w:t>
+          </w:r>
+        </w:p>
+        <w:p>
+          <w:pPr>
+            <w:pStyle w:val="toc 1"/>
+            <w:ind w:left="220"/>
+            <w:tabs>
+              <w:tab w:val="right" w:leader="dot" w:pos="8640"/>
+            </w:tabs>
+          </w:pPr>
+          <w:r>
+            <w:t xml:space="preserve">1.2 Problem Statement</w:t>
+          </w:r>
+          <w:r>
+            <w:tab/>
+            <w:t>13</w:t>
+          </w:r>
+        </w:p>
+        <w:p>
+          <w:pPr>
+            <w:pStyle w:val="toc 1"/>
+            <w:ind w:left="220"/>
+            <w:tabs>
+              <w:tab w:val="right" w:leader="dot" w:pos="8640"/>
+            </w:tabs>
+          </w:pPr>
+          <w:r>
+            <w:t xml:space="preserve">1.3 Objectives</w:t>
+          </w:r>
+          <w:r>
+            <w:tab/>
+            <w:t>14</w:t>
+          </w:r>
+        </w:p>
+        <w:p>
+          <w:pPr>
+            <w:pStyle w:val="toc 1"/>
+            <w:ind w:left="220"/>
+            <w:tabs>
+              <w:tab w:val="right" w:leader="dot" w:pos="8640"/>
+            </w:tabs>
+          </w:pPr>
+          <w:r>
+            <w:t xml:space="preserve">1.4 Scope of Project</w:t>
+          </w:r>
+          <w:r>
+            <w:tab/>
+            <w:t>14</w:t>
+          </w:r>
+        </w:p>
+        <w:p>
+          <w:pPr>
+            <w:pStyle w:val="toc 1"/>
+            <w:ind w:left="220"/>
+            <w:tabs>
+              <w:tab w:val="right" w:leader="dot" w:pos="8640"/>
+            </w:tabs>
+          </w:pPr>
+          <w:r>
+            <w:t xml:space="preserve">1.5 Significance of Project</w:t>
+          </w:r>
+          <w:r>
+            <w:tab/>
+            <w:t>15</w:t>
+          </w:r>
+        </w:p>
+        <w:p>
+          <w:pPr>
+            <w:pStyle w:val="toc 1"/>
+            <w:ind w:left="220"/>
+            <w:tabs>
+              <w:tab w:val="right" w:leader="dot" w:pos="8640"/>
+            </w:tabs>
+          </w:pPr>
+          <w:r>
+            <w:t xml:space="preserve">1.6 Report Organization</w:t>
+          </w:r>
+          <w:r>
+            <w:tab/>
+            <w:t>15</w:t>
+          </w:r>
+        </w:p>
+        <w:p>
+          <w:pPr>
+            <w:pStyle w:val="toc 1"/>
+            <w:ind w:left="0"/>
+            <w:tabs>
+              <w:tab w:val="right" w:leader="dot" w:pos="8640"/>
+            </w:tabs>
+          </w:pPr>
+          <w:r>
+            <w:t xml:space="preserve">CHAPTER 2: LITERATURE REVIEW</w:t>
+          </w:r>
+          <w:r>
+            <w:tab/>
+            <w:t>17</w:t>
+          </w:r>
+        </w:p>
+        <w:p>
+          <w:pPr>
+            <w:pStyle w:val="toc 1"/>
+            <w:ind w:left="220"/>
+            <w:tabs>
+              <w:tab w:val="right" w:leader="dot" w:pos="8640"/>
+            </w:tabs>
+          </w:pPr>
+          <w:r>
+            <w:t xml:space="preserve">2.1 Overview of Domain</w:t>
+          </w:r>
+          <w:r>
+            <w:tab/>
+            <w:t>17</w:t>
+          </w:r>
+        </w:p>
+        <w:p>
+          <w:pPr>
+            <w:pStyle w:val="toc 1"/>
+            <w:ind w:left="220"/>
+            <w:tabs>
+              <w:tab w:val="right" w:leader="dot" w:pos="8640"/>
+            </w:tabs>
+          </w:pPr>
+          <w:r>
+            <w:t xml:space="preserve">2.2 Existing Systems / Related Work</w:t>
+          </w:r>
+          <w:r>
+            <w:tab/>
+            <w:t>17</w:t>
+          </w:r>
+        </w:p>
+        <w:p>
+          <w:pPr>
+            <w:pStyle w:val="toc 1"/>
+            <w:ind w:left="220"/>
+            <w:tabs>
+              <w:tab w:val="right" w:leader="dot" w:pos="8640"/>
+            </w:tabs>
+          </w:pPr>
+          <w:r>
+            <w:t xml:space="preserve">2.3 Comparison of Existing Systems</w:t>
+          </w:r>
+          <w:r>
+            <w:tab/>
+            <w:t>19</w:t>
+          </w:r>
+        </w:p>
+        <w:p>
+          <w:pPr>
+            <w:pStyle w:val="toc 1"/>
+            <w:ind w:left="220"/>
+            <w:tabs>
+              <w:tab w:val="right" w:leader="dot" w:pos="8640"/>
+            </w:tabs>
+          </w:pPr>
+          <w:r>
+            <w:t xml:space="preserve">2.4 Research Gap</w:t>
+          </w:r>
+          <w:r>
+            <w:tab/>
+            <w:t>20</w:t>
+          </w:r>
+        </w:p>
+        <w:p>
+          <w:pPr>
+            <w:pStyle w:val="toc 1"/>
+            <w:ind w:left="220"/>
+            <w:tabs>
+              <w:tab w:val="right" w:leader="dot" w:pos="8640"/>
+            </w:tabs>
+          </w:pPr>
+          <w:r>
+            <w:t xml:space="preserve">2.5 Proposed Solution</w:t>
+          </w:r>
+          <w:r>
+            <w:tab/>
+            <w:t>21</w:t>
+          </w:r>
+        </w:p>
+        <w:p>
+          <w:pPr>
+            <w:pStyle w:val="toc 1"/>
+            <w:ind w:left="0"/>
+            <w:tabs>
+              <w:tab w:val="right" w:leader="dot" w:pos="8640"/>
+            </w:tabs>
+          </w:pPr>
+          <w:r>
+            <w:t xml:space="preserve">CHAPTER 3: SYSTEM ANALYSIS &amp; REQUIREMENTS</w:t>
+          </w:r>
+          <w:r>
+            <w:tab/>
+            <w:t>22</w:t>
+          </w:r>
+        </w:p>
+        <w:p>
+          <w:pPr>
+            <w:pStyle w:val="toc 1"/>
+            <w:ind w:left="220"/>
+            <w:tabs>
+              <w:tab w:val="right" w:leader="dot" w:pos="8640"/>
+            </w:tabs>
+          </w:pPr>
+          <w:r>
+            <w:t xml:space="preserve">3.1 Feasibility Study</w:t>
+          </w:r>
+          <w:r>
+            <w:tab/>
+            <w:t>22</w:t>
+          </w:r>
+        </w:p>
+        <w:p>
+          <w:pPr>
+            <w:pStyle w:val="toc 1"/>
+            <w:ind w:left="220"/>
+            <w:tabs>
+              <w:tab w:val="right" w:leader="dot" w:pos="8640"/>
+            </w:tabs>
+          </w:pPr>
+          <w:r>
+            <w:t xml:space="preserve">3.2 Functional Requirements</w:t>
+          </w:r>
+          <w:r>
+            <w:tab/>
+            <w:t>23</w:t>
+          </w:r>
+        </w:p>
+        <w:p>
+          <w:pPr>
+            <w:pStyle w:val="toc 1"/>
+            <w:ind w:left="220"/>
+            <w:tabs>
+              <w:tab w:val="right" w:leader="dot" w:pos="8640"/>
+            </w:tabs>
+          </w:pPr>
+          <w:r>
+            <w:t xml:space="preserve">3.3 Non-Functional Requirements</w:t>
+          </w:r>
+          <w:r>
+            <w:tab/>
+            <w:t>26</w:t>
+          </w:r>
+        </w:p>
+        <w:p>
+          <w:pPr>
+            <w:pStyle w:val="toc 1"/>
+            <w:ind w:left="220"/>
+            <w:tabs>
+              <w:tab w:val="right" w:leader="dot" w:pos="8640"/>
+            </w:tabs>
+          </w:pPr>
+          <w:r>
+            <w:t xml:space="preserve">3.4 Tools and Technologies Used</w:t>
+          </w:r>
+          <w:r>
+            <w:tab/>
+            <w:t>27</w:t>
+          </w:r>
+        </w:p>
+        <w:p>
+          <w:pPr>
+            <w:pStyle w:val="toc 1"/>
+            <w:ind w:left="220"/>
+            <w:tabs>
+              <w:tab w:val="right" w:leader="dot" w:pos="8640"/>
+            </w:tabs>
+          </w:pPr>
+          <w:r>
+            <w:t xml:space="preserve">3.5 Use Cases / User Stories</w:t>
+          </w:r>
+          <w:r>
+            <w:tab/>
+            <w:t>29</w:t>
+          </w:r>
+        </w:p>
+        <w:p>
+          <w:pPr>
+            <w:pStyle w:val="toc 1"/>
+            <w:ind w:left="220"/>
+            <w:tabs>
+              <w:tab w:val="right" w:leader="dot" w:pos="8640"/>
+            </w:tabs>
+          </w:pPr>
+          <w:r>
+            <w:t xml:space="preserve">3.6 Use Cases Table</w:t>
+          </w:r>
+          <w:r>
+            <w:tab/>
+            <w:t>32</w:t>
+          </w:r>
+        </w:p>
+        <w:p>
+          <w:pPr>
+            <w:pStyle w:val="toc 1"/>
+            <w:ind w:left="0"/>
+            <w:tabs>
+              <w:tab w:val="right" w:leader="dot" w:pos="8640"/>
+            </w:tabs>
+          </w:pPr>
+          <w:r>
+            <w:t xml:space="preserve">CHAPTER 4: SYSTEM DESIGN</w:t>
+          </w:r>
+          <w:r>
+            <w:tab/>
+            <w:t>34</w:t>
+          </w:r>
+        </w:p>
+        <w:p>
+          <w:pPr>
+            <w:pStyle w:val="toc 1"/>
+            <w:ind w:left="220"/>
+            <w:tabs>
+              <w:tab w:val="right" w:leader="dot" w:pos="8640"/>
+            </w:tabs>
+          </w:pPr>
+          <w:r>
+            <w:t xml:space="preserve">4.1 System Architecture Description &amp; Design</w:t>
+          </w:r>
+          <w:r>
+            <w:tab/>
+            <w:t>34</w:t>
+          </w:r>
+        </w:p>
+        <w:p>
+          <w:pPr>
+            <w:pStyle w:val="toc 1"/>
+            <w:ind w:left="220"/>
+            <w:tabs>
+              <w:tab w:val="right" w:leader="dot" w:pos="8640"/>
+            </w:tabs>
+          </w:pPr>
+          <w:r>
+            <w:t xml:space="preserve">4.2 Data Flow Diagrams</w:t>
+          </w:r>
+          <w:r>
+            <w:tab/>
+            <w:t>36</w:t>
+          </w:r>
+        </w:p>
+        <w:p>
+          <w:pPr>
+            <w:pStyle w:val="toc 1"/>
+            <w:ind w:left="220"/>
+            <w:tabs>
+              <w:tab w:val="right" w:leader="dot" w:pos="8640"/>
+            </w:tabs>
+          </w:pPr>
+          <w:r>
+            <w:t xml:space="preserve">4.3 UML Diagrams</w:t>
+          </w:r>
+          <w:r>
+            <w:tab/>
+            <w:t>39</w:t>
+          </w:r>
+        </w:p>
+        <w:p>
+          <w:pPr>
+            <w:pStyle w:val="toc 1"/>
+            <w:ind w:left="220"/>
+            <w:tabs>
+              <w:tab w:val="right" w:leader="dot" w:pos="8640"/>
+            </w:tabs>
+          </w:pPr>
+          <w:r>
+            <w:t xml:space="preserve">4.4 Database Design (ERD, Schema, Data Dictionary)</w:t>
+          </w:r>
+          <w:r>
+            <w:tab/>
+            <w:t>43</w:t>
+          </w:r>
+        </w:p>
+        <w:p>
+          <w:pPr>
+            <w:pStyle w:val="toc 1"/>
+            <w:ind w:left="220"/>
+            <w:tabs>
+              <w:tab w:val="right" w:leader="dot" w:pos="8640"/>
+            </w:tabs>
+          </w:pPr>
+          <w:r>
+            <w:t xml:space="preserve">4.5 UI/UX Design</w:t>
+          </w:r>
+          <w:r>
+            <w:tab/>
+            <w:t>48</w:t>
+          </w:r>
+        </w:p>
+        <w:p>
+          <w:pPr>
+            <w:pStyle w:val="toc 1"/>
+            <w:ind w:left="0"/>
+            <w:tabs>
+              <w:tab w:val="right" w:leader="dot" w:pos="8640"/>
+            </w:tabs>
+          </w:pPr>
+          <w:r>
+            <w:t xml:space="preserve">CHAPTER 5: IMPLEMENTATION</w:t>
+          </w:r>
+          <w:r>
+            <w:tab/>
+            <w:t>53</w:t>
+          </w:r>
+        </w:p>
+        <w:p>
+          <w:pPr>
+            <w:pStyle w:val="toc 1"/>
+            <w:ind w:left="220"/>
+            <w:tabs>
+              <w:tab w:val="right" w:leader="dot" w:pos="8640"/>
+            </w:tabs>
+          </w:pPr>
+          <w:r>
+            <w:t xml:space="preserve">5.1 Development Environment Setup</w:t>
+          </w:r>
+          <w:r>
+            <w:tab/>
+            <w:t>53</w:t>
+          </w:r>
+        </w:p>
+        <w:p>
+          <w:pPr>
+            <w:pStyle w:val="toc 1"/>
+            <w:ind w:left="220"/>
+            <w:tabs>
+              <w:tab w:val="right" w:leader="dot" w:pos="8640"/>
+            </w:tabs>
+          </w:pPr>
+          <w:r>
+            <w:t xml:space="preserve">5.2 Implementation Details</w:t>
+          </w:r>
+          <w:r>
+            <w:tab/>
+            <w:t>54</w:t>
+          </w:r>
+        </w:p>
+        <w:p>
+          <w:pPr>
+            <w:pStyle w:val="toc 1"/>
+            <w:ind w:left="220"/>
+            <w:tabs>
+              <w:tab w:val="right" w:leader="dot" w:pos="8640"/>
+            </w:tabs>
+          </w:pPr>
+          <w:r>
+            <w:t xml:space="preserve">5.3 Code Snippets with Explanation</w:t>
+          </w:r>
+          <w:r>
+            <w:tab/>
+            <w:t>57</w:t>
+          </w:r>
+        </w:p>
+        <w:p>
+          <w:pPr>
+            <w:pStyle w:val="toc 1"/>
+            <w:ind w:left="220"/>
+            <w:tabs>
+              <w:tab w:val="right" w:leader="dot" w:pos="8640"/>
+            </w:tabs>
+          </w:pPr>
+          <w:r>
+            <w:t xml:space="preserve">5.4 Database Implementation</w:t>
+          </w:r>
+          <w:r>
+            <w:tab/>
+            <w:t>59</w:t>
+          </w:r>
+        </w:p>
+        <w:p>
+          <w:pPr>
+            <w:pStyle w:val="toc 1"/>
+            <w:ind w:left="0"/>
+            <w:tabs>
+              <w:tab w:val="right" w:leader="dot" w:pos="8640"/>
+            </w:tabs>
+          </w:pPr>
+          <w:r>
+            <w:t xml:space="preserve">CHAPTER 6: TESTING &amp; RESULTS</w:t>
+          </w:r>
+          <w:r>
+            <w:tab/>
+            <w:t>61</w:t>
+          </w:r>
+        </w:p>
+        <w:p>
+          <w:pPr>
+            <w:pStyle w:val="toc 1"/>
+            <w:ind w:left="220"/>
+            <w:tabs>
+              <w:tab w:val="right" w:leader="dot" w:pos="8640"/>
+            </w:tabs>
+          </w:pPr>
+          <w:r>
+            <w:t xml:space="preserve">6.1 Testing Strategy</w:t>
+          </w:r>
+          <w:r>
+            <w:tab/>
+            <w:t>61</w:t>
+          </w:r>
+        </w:p>
+        <w:p>
+          <w:pPr>
+            <w:pStyle w:val="toc 1"/>
+            <w:ind w:left="220"/>
+            <w:tabs>
+              <w:tab w:val="right" w:leader="dot" w:pos="8640"/>
+            </w:tabs>
+          </w:pPr>
+          <w:r>
+            <w:t xml:space="preserve">6.2 Test Cases and Results</w:t>
+          </w:r>
+          <w:r>
+            <w:tab/>
+            <w:t>61</w:t>
+          </w:r>
+        </w:p>
+        <w:p>
+          <w:pPr>
+            <w:pStyle w:val="toc 1"/>
+            <w:ind w:left="220"/>
+            <w:tabs>
+              <w:tab w:val="right" w:leader="dot" w:pos="8640"/>
+            </w:tabs>
+          </w:pPr>
+          <w:r>
+            <w:t xml:space="preserve">6.3 Performance Evaluation</w:t>
+          </w:r>
+          <w:r>
+            <w:tab/>
+            <w:t>64</w:t>
+          </w:r>
+        </w:p>
+        <w:p>
+          <w:pPr>
+            <w:pStyle w:val="toc 1"/>
+            <w:ind w:left="220"/>
+            <w:tabs>
+              <w:tab w:val="right" w:leader="dot" w:pos="8640"/>
+            </w:tabs>
+          </w:pPr>
+          <w:r>
+            <w:t xml:space="preserve">6.4 Results and Discussion</w:t>
+          </w:r>
+          <w:r>
+            <w:tab/>
+            <w:t>66</w:t>
+          </w:r>
+        </w:p>
+        <w:p>
+          <w:pPr>
+            <w:pStyle w:val="toc 1"/>
+            <w:ind w:left="0"/>
+            <w:tabs>
+              <w:tab w:val="right" w:leader="dot" w:pos="8640"/>
+            </w:tabs>
+          </w:pPr>
+          <w:r>
+            <w:t xml:space="preserve">CHAPTER 7: CONCLUSION &amp; FUTURE WORK</w:t>
+          </w:r>
+          <w:r>
+            <w:tab/>
+            <w:t>68</w:t>
+          </w:r>
+        </w:p>
+        <w:p>
+          <w:pPr>
+            <w:pStyle w:val="toc 1"/>
+            <w:ind w:left="220"/>
+            <w:tabs>
+              <w:tab w:val="right" w:leader="dot" w:pos="8640"/>
+            </w:tabs>
+          </w:pPr>
+          <w:r>
+            <w:t xml:space="preserve">7.1 Conclusion</w:t>
+          </w:r>
+          <w:r>
+            <w:tab/>
+            <w:t>68</w:t>
+          </w:r>
+        </w:p>
+        <w:p>
+          <w:pPr>
+            <w:pStyle w:val="toc 1"/>
+            <w:ind w:left="220"/>
+            <w:tabs>
+              <w:tab w:val="right" w:leader="dot" w:pos="8640"/>
+            </w:tabs>
+          </w:pPr>
+          <w:r>
+            <w:t xml:space="preserve">7.2 Limitations</w:t>
+          </w:r>
+          <w:r>
+            <w:tab/>
+            <w:t>68</w:t>
+          </w:r>
+        </w:p>
+        <w:p>
+          <w:pPr>
+            <w:pStyle w:val="toc 1"/>
+            <w:ind w:left="220"/>
+            <w:tabs>
+              <w:tab w:val="right" w:leader="dot" w:pos="8640"/>
+            </w:tabs>
+          </w:pPr>
+          <w:r>
+            <w:t xml:space="preserve">7.3 Future Enhancements</w:t>
+          </w:r>
+          <w:r>
+            <w:tab/>
+            <w:t>69</w:t>
+          </w:r>
+        </w:p>
+        <w:p>
+          <w:pPr>
+            <w:pStyle w:val="toc 1"/>
+            <w:ind w:left="0"/>
+            <w:tabs>
+              <w:tab w:val="right" w:leader="dot" w:pos="8640"/>
+            </w:tabs>
+          </w:pPr>
+          <w:r>
+            <w:t xml:space="preserve">REFERENCES</w:t>
+          </w:r>
+          <w:r>
+            <w:tab/>
+            <w:t>70</w:t>
+          </w:r>
+        </w:p>
+        <w:p>
+          <w:pPr>
+            <w:pStyle w:val="toc 1"/>
+            <w:ind w:left="0"/>
+            <w:tabs>
+              <w:tab w:val="right" w:leader="dot" w:pos="8640"/>
+            </w:tabs>
+          </w:pPr>
+          <w:r>
+            <w:t xml:space="preserve">APPENDICES</w:t>
+          </w:r>
+          <w:r>
+            <w:tab/>
+            <w:t>71</w:t>
+          </w:r>
+        </w:p>
+        <w:p>
+          <w:pPr>
+            <w:pStyle w:val="toc 1"/>
+            <w:ind w:left="220"/>
+            <w:tabs>
+              <w:tab w:val="right" w:leader="dot" w:pos="8640"/>
+            </w:tabs>
+          </w:pPr>
+          <w:r>
+            <w:t xml:space="preserve">Appendix A: User Manual</w:t>
+          </w:r>
+          <w:r>
+            <w:tab/>
+            <w:t>71</w:t>
+          </w:r>
+        </w:p>
+        <w:p>
+          <w:pPr>
+            <w:pStyle w:val="toc 1"/>
+            <w:ind w:left="220"/>
+            <w:tabs>
+              <w:tab w:val="right" w:leader="dot" w:pos="8640"/>
+            </w:tabs>
+          </w:pPr>
+          <w:r>
+            <w:t xml:space="preserve">Appendix B: Sample Code</w:t>
+          </w:r>
+          <w:r>
+            <w:tab/>
+            <w:t>71</w:t>
+          </w:r>
+        </w:p>
+        <w:p>
+          <w:pPr>
+            <w:pStyle w:val="toc 1"/>
+            <w:ind w:left="220"/>
+            <w:tabs>
+              <w:tab w:val="right" w:leader="dot" w:pos="8640"/>
+            </w:tabs>
+          </w:pPr>
+          <w:r>
+            <w:t xml:space="preserve">Appendix C: Gantt Chart (FYP-I and FYP-II)</w:t>
+          </w:r>
+          <w:r>
+            <w:tab/>
+            <w:t>71</w:t>
+          </w:r>
+          <w:r>
             <w:fldChar w:fldCharType="end"/>
           </w:r>
         </w:p>
@@ -1365,17 +2197,280 @@
       </w:r>
     </w:p>
     <w:p>
-      <w:r>
-        <w:fldChar w:fldCharType="begin" w:dirty="true"/>
-      </w:r>
-      <w:r>
+      <w:pPr>
+        <w:pStyle w:val="toc 1"/>
+        <w:ind w:left="0"/>
+        <w:tabs>
+          <w:tab w:val="right" w:leader="dot" w:pos="8640"/>
+        </w:tabs>
+      </w:pPr>
+      <w:r>
+        <w:fldChar w:fldCharType="begin"/>
         <w:instrText xml:space="preserve"> TOC \h \z \t "Image Caption,1" </w:instrText>
-      </w:r>
-      <w:r>
         <w:fldChar w:fldCharType="separate"/>
       </w:r>
       <w:r>
-        <w:t>Right-click and choose "Update Field" to build the List of Figures.</w:t>
+        <w:t xml:space="preserve">Figure 3.1: Use Case Diagram</w:t>
+      </w:r>
+      <w:r>
+        <w:tab/>
+        <w:t>30</w:t>
+      </w:r>
+    </w:p>
+    <w:p>
+      <w:pPr>
+        <w:pStyle w:val="toc 1"/>
+        <w:ind w:left="0"/>
+        <w:tabs>
+          <w:tab w:val="right" w:leader="dot" w:pos="8640"/>
+        </w:tabs>
+      </w:pPr>
+      <w:r>
+        <w:t xml:space="preserve">Figure 4.1: System Architecture</w:t>
+      </w:r>
+      <w:r>
+        <w:tab/>
+        <w:t>36</w:t>
+      </w:r>
+    </w:p>
+    <w:p>
+      <w:pPr>
+        <w:pStyle w:val="toc 1"/>
+        <w:ind w:left="0"/>
+        <w:tabs>
+          <w:tab w:val="right" w:leader="dot" w:pos="8640"/>
+        </w:tabs>
+      </w:pPr>
+      <w:r>
+        <w:t xml:space="preserve">Figure 4.2: DFD Level 0 (Context Diagram)</w:t>
+      </w:r>
+      <w:r>
+        <w:tab/>
+        <w:t>37</w:t>
+      </w:r>
+    </w:p>
+    <w:p>
+      <w:pPr>
+        <w:pStyle w:val="toc 1"/>
+        <w:ind w:left="0"/>
+        <w:tabs>
+          <w:tab w:val="right" w:leader="dot" w:pos="8640"/>
+        </w:tabs>
+      </w:pPr>
+      <w:r>
+        <w:t xml:space="preserve">Figure 4.3: DFD Level 1</w:t>
+      </w:r>
+      <w:r>
+        <w:tab/>
+        <w:t>38</w:t>
+      </w:r>
+    </w:p>
+    <w:p>
+      <w:pPr>
+        <w:pStyle w:val="toc 1"/>
+        <w:ind w:left="0"/>
+        <w:tabs>
+          <w:tab w:val="right" w:leader="dot" w:pos="8640"/>
+        </w:tabs>
+      </w:pPr>
+      <w:r>
+        <w:t xml:space="preserve">Figure 4.4: DFD Level 2</w:t>
+      </w:r>
+      <w:r>
+        <w:tab/>
+        <w:t>39</w:t>
+      </w:r>
+    </w:p>
+    <w:p>
+      <w:pPr>
+        <w:pStyle w:val="toc 1"/>
+        <w:ind w:left="0"/>
+        <w:tabs>
+          <w:tab w:val="right" w:leader="dot" w:pos="8640"/>
+        </w:tabs>
+      </w:pPr>
+      <w:r>
+        <w:t xml:space="preserve">Figure 4.5: Class Diagram</w:t>
+      </w:r>
+      <w:r>
+        <w:tab/>
+        <w:t>40</w:t>
+      </w:r>
+    </w:p>
+    <w:p>
+      <w:pPr>
+        <w:pStyle w:val="toc 1"/>
+        <w:ind w:left="0"/>
+        <w:tabs>
+          <w:tab w:val="right" w:leader="dot" w:pos="8640"/>
+        </w:tabs>
+      </w:pPr>
+      <w:r>
+        <w:t xml:space="preserve">Figure 4.6: Activity Diagram</w:t>
+      </w:r>
+      <w:r>
+        <w:tab/>
+        <w:t>41</w:t>
+      </w:r>
+    </w:p>
+    <w:p>
+      <w:pPr>
+        <w:pStyle w:val="toc 1"/>
+        <w:ind w:left="0"/>
+        <w:tabs>
+          <w:tab w:val="right" w:leader="dot" w:pos="8640"/>
+        </w:tabs>
+      </w:pPr>
+      <w:r>
+        <w:t xml:space="preserve">Figure 4.7: Component Diagram</w:t>
+      </w:r>
+      <w:r>
+        <w:tab/>
+        <w:t>42</w:t>
+      </w:r>
+    </w:p>
+    <w:p>
+      <w:pPr>
+        <w:pStyle w:val="toc 1"/>
+        <w:ind w:left="0"/>
+        <w:tabs>
+          <w:tab w:val="right" w:leader="dot" w:pos="8640"/>
+        </w:tabs>
+      </w:pPr>
+      <w:r>
+        <w:t xml:space="preserve">Figure 4.8: Sequence Diagram (Streaming RAG Query)</w:t>
+      </w:r>
+      <w:r>
+        <w:tab/>
+        <w:t>43</w:t>
+      </w:r>
+    </w:p>
+    <w:p>
+      <w:pPr>
+        <w:pStyle w:val="toc 1"/>
+        <w:ind w:left="0"/>
+        <w:tabs>
+          <w:tab w:val="right" w:leader="dot" w:pos="8640"/>
+        </w:tabs>
+      </w:pPr>
+      <w:r>
+        <w:t xml:space="preserve">Figure 4.9: Entity-Relationship Diagram</w:t>
+      </w:r>
+      <w:r>
+        <w:tab/>
+        <w:t>44</w:t>
+      </w:r>
+    </w:p>
+    <w:p>
+      <w:pPr>
+        <w:pStyle w:val="toc 1"/>
+        <w:ind w:left="0"/>
+        <w:tabs>
+          <w:tab w:val="right" w:leader="dot" w:pos="8640"/>
+        </w:tabs>
+      </w:pPr>
+      <w:r>
+        <w:t xml:space="preserve">Figure 4.10: Dashboard overview</w:t>
+      </w:r>
+      <w:r>
+        <w:tab/>
+        <w:t>50</w:t>
+      </w:r>
+    </w:p>
+    <w:p>
+      <w:pPr>
+        <w:pStyle w:val="toc 1"/>
+        <w:ind w:left="0"/>
+        <w:tabs>
+          <w:tab w:val="right" w:leader="dot" w:pos="8640"/>
+        </w:tabs>
+      </w:pPr>
+      <w:r>
+        <w:t xml:space="preserve">Figure 4.11: Documents management with upload and processing status</w:t>
+      </w:r>
+      <w:r>
+        <w:tab/>
+        <w:t>50</w:t>
+      </w:r>
+    </w:p>
+    <w:p>
+      <w:pPr>
+        <w:pStyle w:val="toc 1"/>
+        <w:ind w:left="0"/>
+        <w:tabs>
+          <w:tab w:val="right" w:leader="dot" w:pos="8640"/>
+        </w:tabs>
+      </w:pPr>
+      <w:r>
+        <w:t xml:space="preserve">Figure 4.12: Semantic search across the document library with match scores and skill filters</w:t>
+      </w:r>
+      <w:r>
+        <w:tab/>
+        <w:t>51</w:t>
+      </w:r>
+    </w:p>
+    <w:p>
+      <w:pPr>
+        <w:pStyle w:val="toc 1"/>
+        <w:ind w:left="0"/>
+        <w:tabs>
+          <w:tab w:val="right" w:leader="dot" w:pos="8640"/>
+        </w:tabs>
+      </w:pPr>
+      <w:r>
+        <w:t xml:space="preserve">Figure 4.13: Ask Hireflow, conversational question answering grounded in the library with source citations</w:t>
+      </w:r>
+      <w:r>
+        <w:tab/>
+        <w:t>51</w:t>
+      </w:r>
+    </w:p>
+    <w:p>
+      <w:pPr>
+        <w:pStyle w:val="toc 1"/>
+        <w:ind w:left="0"/>
+        <w:tabs>
+          <w:tab w:val="right" w:leader="dot" w:pos="8640"/>
+        </w:tabs>
+      </w:pPr>
+      <w:r>
+        <w:t xml:space="preserve">Figure 4.14: Candidate screening list with match scores</w:t>
+      </w:r>
+      <w:r>
+        <w:tab/>
+        <w:t>52</w:t>
+      </w:r>
+    </w:p>
+    <w:p>
+      <w:pPr>
+        <w:pStyle w:val="toc 1"/>
+        <w:ind w:left="0"/>
+        <w:tabs>
+          <w:tab w:val="right" w:leader="dot" w:pos="8640"/>
+        </w:tabs>
+      </w:pPr>
+      <w:r>
+        <w:t xml:space="preserve">Figure 6.1: Login screen under test</w:t>
+      </w:r>
+      <w:r>
+        <w:tab/>
+        <w:t>64</w:t>
+      </w:r>
+    </w:p>
+    <w:p>
+      <w:pPr>
+        <w:pStyle w:val="toc 1"/>
+        <w:ind w:left="0"/>
+        <w:tabs>
+          <w:tab w:val="right" w:leader="dot" w:pos="8640"/>
+        </w:tabs>
+      </w:pPr>
+      <w:r>
+        <w:t xml:space="preserve">Figure 6.2: Hybrid search and RAG question-answering under test</w:t>
+      </w:r>
+      <w:r>
+        <w:tab/>
+        <w:t>64</w:t>
       </w:r>
       <w:r>
         <w:fldChar w:fldCharType="end"/>
@@ -1395,17 +2490,248 @@
       </w:r>
     </w:p>
     <w:p>
-      <w:r>
-        <w:fldChar w:fldCharType="begin" w:dirty="true"/>
-      </w:r>
-      <w:r>
+      <w:pPr>
+        <w:pStyle w:val="toc 1"/>
+        <w:ind w:left="0"/>
+        <w:tabs>
+          <w:tab w:val="right" w:leader="dot" w:pos="8640"/>
+        </w:tabs>
+      </w:pPr>
+      <w:r>
+        <w:fldChar w:fldCharType="begin"/>
         <w:instrText xml:space="preserve"> TOC \h \z \t "Table Caption,1" </w:instrText>
-      </w:r>
-      <w:r>
         <w:fldChar w:fldCharType="separate"/>
       </w:r>
       <w:r>
-        <w:t>Right-click and choose "Update Field" to build the List of Tables.</w:t>
+        <w:t xml:space="preserve">Table 2.1: Review of Existing Systems and Related Work</w:t>
+      </w:r>
+      <w:r>
+        <w:tab/>
+        <w:t>19</w:t>
+      </w:r>
+    </w:p>
+    <w:p>
+      <w:pPr>
+        <w:pStyle w:val="toc 1"/>
+        <w:ind w:left="0"/>
+        <w:tabs>
+          <w:tab w:val="right" w:leader="dot" w:pos="8640"/>
+        </w:tabs>
+      </w:pPr>
+      <w:r>
+        <w:t xml:space="preserve">Table 2.2: Comparison of Representative Systems</w:t>
+      </w:r>
+      <w:r>
+        <w:tab/>
+        <w:t>20</w:t>
+      </w:r>
+    </w:p>
+    <w:p>
+      <w:pPr>
+        <w:pStyle w:val="toc 1"/>
+        <w:ind w:left="0"/>
+        <w:tabs>
+          <w:tab w:val="right" w:leader="dot" w:pos="8640"/>
+        </w:tabs>
+      </w:pPr>
+      <w:r>
+        <w:t xml:space="preserve">Table 2.3: Research Gap Summary</w:t>
+      </w:r>
+      <w:r>
+        <w:tab/>
+        <w:t>21</w:t>
+      </w:r>
+    </w:p>
+    <w:p>
+      <w:pPr>
+        <w:pStyle w:val="toc 1"/>
+        <w:ind w:left="0"/>
+        <w:tabs>
+          <w:tab w:val="right" w:leader="dot" w:pos="8640"/>
+        </w:tabs>
+      </w:pPr>
+      <w:r>
+        <w:t xml:space="preserve">Table 3.1: Functional Requirements (FR01-FR20)</w:t>
+      </w:r>
+      <w:r>
+        <w:tab/>
+        <w:t>25</w:t>
+      </w:r>
+    </w:p>
+    <w:p>
+      <w:pPr>
+        <w:pStyle w:val="toc 1"/>
+        <w:ind w:left="0"/>
+        <w:tabs>
+          <w:tab w:val="right" w:leader="dot" w:pos="8640"/>
+        </w:tabs>
+      </w:pPr>
+      <w:r>
+        <w:t xml:space="preserve">Table 3.2: Tools and Technologies</w:t>
+      </w:r>
+      <w:r>
+        <w:tab/>
+        <w:t>29</w:t>
+      </w:r>
+    </w:p>
+    <w:p>
+      <w:pPr>
+        <w:pStyle w:val="toc 1"/>
+        <w:ind w:left="0"/>
+        <w:tabs>
+          <w:tab w:val="right" w:leader="dot" w:pos="8640"/>
+        </w:tabs>
+      </w:pPr>
+      <w:r>
+        <w:t xml:space="preserve">Table 3.3: Summary of Use Cases (UC-01-UC-12)</w:t>
+      </w:r>
+      <w:r>
+        <w:tab/>
+        <w:t>32</w:t>
+      </w:r>
+    </w:p>
+    <w:p>
+      <w:pPr>
+        <w:pStyle w:val="toc 1"/>
+        <w:ind w:left="0"/>
+        <w:tabs>
+          <w:tab w:val="right" w:leader="dot" w:pos="8640"/>
+        </w:tabs>
+      </w:pPr>
+      <w:r>
+        <w:t xml:space="preserve">Table 3.4: Sample Use Case, User Login</w:t>
+      </w:r>
+      <w:r>
+        <w:tab/>
+        <w:t>33</w:t>
+      </w:r>
+    </w:p>
+    <w:p>
+      <w:pPr>
+        <w:pStyle w:val="toc 1"/>
+        <w:ind w:left="0"/>
+        <w:tabs>
+          <w:tab w:val="right" w:leader="dot" w:pos="8640"/>
+        </w:tabs>
+      </w:pPr>
+      <w:r>
+        <w:t xml:space="preserve">Table 4.1: users Data Dictionary</w:t>
+      </w:r>
+      <w:r>
+        <w:tab/>
+        <w:t>45</w:t>
+      </w:r>
+    </w:p>
+    <w:p>
+      <w:pPr>
+        <w:pStyle w:val="toc 1"/>
+        <w:ind w:left="0"/>
+        <w:tabs>
+          <w:tab w:val="right" w:leader="dot" w:pos="8640"/>
+        </w:tabs>
+      </w:pPr>
+      <w:r>
+        <w:t xml:space="preserve">Table 4.2: documents Data Dictionary</w:t>
+      </w:r>
+      <w:r>
+        <w:tab/>
+        <w:t>46</w:t>
+      </w:r>
+    </w:p>
+    <w:p>
+      <w:pPr>
+        <w:pStyle w:val="toc 1"/>
+        <w:ind w:left="0"/>
+        <w:tabs>
+          <w:tab w:val="right" w:leader="dot" w:pos="8640"/>
+        </w:tabs>
+      </w:pPr>
+      <w:r>
+        <w:t xml:space="preserve">Table 4.3: jobs Data Dictionary</w:t>
+      </w:r>
+      <w:r>
+        <w:tab/>
+        <w:t>47</w:t>
+      </w:r>
+    </w:p>
+    <w:p>
+      <w:pPr>
+        <w:pStyle w:val="toc 1"/>
+        <w:ind w:left="0"/>
+        <w:tabs>
+          <w:tab w:val="right" w:leader="dot" w:pos="8640"/>
+        </w:tabs>
+      </w:pPr>
+      <w:r>
+        <w:t xml:space="preserve">Table 4.4: candidates Data Dictionary</w:t>
+      </w:r>
+      <w:r>
+        <w:tab/>
+        <w:t>48</w:t>
+      </w:r>
+    </w:p>
+    <w:p>
+      <w:pPr>
+        <w:pStyle w:val="toc 1"/>
+        <w:ind w:left="0"/>
+        <w:tabs>
+          <w:tab w:val="right" w:leader="dot" w:pos="8640"/>
+        </w:tabs>
+      </w:pPr>
+      <w:r>
+        <w:t xml:space="preserve">Table 5.1: Development Environment Services and Ports</w:t>
+      </w:r>
+      <w:r>
+        <w:tab/>
+        <w:t>54</w:t>
+      </w:r>
+    </w:p>
+    <w:p>
+      <w:pPr>
+        <w:pStyle w:val="toc 1"/>
+        <w:ind w:left="0"/>
+        <w:tabs>
+          <w:tab w:val="right" w:leader="dot" w:pos="8640"/>
+        </w:tabs>
+      </w:pPr>
+      <w:r>
+        <w:t xml:space="preserve">Table 5.2: Document Ingestion Pipeline Stages</w:t>
+      </w:r>
+      <w:r>
+        <w:tab/>
+        <w:t>56</w:t>
+      </w:r>
+    </w:p>
+    <w:p>
+      <w:pPr>
+        <w:pStyle w:val="toc 1"/>
+        <w:ind w:left="0"/>
+        <w:tabs>
+          <w:tab w:val="right" w:leader="dot" w:pos="8640"/>
+        </w:tabs>
+      </w:pPr>
+      <w:r>
+        <w:t xml:space="preserve">Table 6.1: Test Case Traceability Matrix</w:t>
+      </w:r>
+      <w:r>
+        <w:tab/>
+        <w:t>64</w:t>
+      </w:r>
+    </w:p>
+    <w:p>
+      <w:pPr>
+        <w:pStyle w:val="toc 1"/>
+        <w:ind w:left="0"/>
+        <w:tabs>
+          <w:tab w:val="right" w:leader="dot" w:pos="8640"/>
+        </w:tabs>
+      </w:pPr>
+      <w:r>
+        <w:t xml:space="preserve">Table 6.2: Measured Performance (Development Stack)</w:t>
+      </w:r>
+      <w:r>
+        <w:tab/>
+        <w:t>65</w:t>
       </w:r>
       <w:r>
         <w:fldChar w:fldCharType="end"/>
@@ -23169,7 +24495,7 @@
     </w:lvl>
   </w:abstractNum>
   <w:abstractNum w:abstractNumId="14">
-    <w:nsid w:val="01E80846"/>
+    <w:nsid w:val="0365BD66"/>
     <w:multiLevelType w:val="multilevel"/>
     <w:lvl w:ilvl="0">
       <w:start w:val="1"/>
@@ -23254,7 +24580,7 @@
     </w:lvl>
   </w:abstractNum>
   <w:abstractNum w:abstractNumId="15">
-    <w:nsid w:val="0088885C"/>
+    <w:nsid w:val="01AF2130"/>
     <w:multiLevelType w:val="multilevel"/>
     <w:lvl w:ilvl="0">
       <w:numFmt w:val="bullet"/>

</xml_diff>